<commit_message>
feat: implement new dashboard pages, bank management components, and support interface with user manual documentation
</commit_message>
<xml_diff>
--- a/manual_usuario_sibap.docx
+++ b/manual_usuario_sibap.docx
@@ -33,6 +33,12 @@
         </w:rPr>
         <w:t>Sistema Inteligente de Bancos de Preguntas</w:t>
       </w:r>
+    </w:p>
+    <w:p>
+      <w:pPr>
+        <w:spacing w:after="600"/>
+        <w:jc w:val="center"/>
+      </w:pPr>
     </w:p>
     <w:p>
       <w:pPr>
@@ -788,12 +794,37 @@
         </w:numPr>
         <w:spacing w:before="60" w:after="60"/>
       </w:pPr>
-      <w:r>
-        <w:rPr>
-          <w:b/>
-          <w:bCs/>
-        </w:rPr>
-        <w:t>Conceptos a Evaluar (Keywords):</w:t>
+      <w:proofErr w:type="gramStart"/>
+      <w:r>
+        <w:rPr>
+          <w:b/>
+          <w:bCs/>
+        </w:rPr>
+        <w:t>Conceptos a Evaluar</w:t>
+      </w:r>
+      <w:proofErr w:type="gramEnd"/>
+      <w:r>
+        <w:rPr>
+          <w:b/>
+          <w:bCs/>
+        </w:rPr>
+        <w:t xml:space="preserve"> (</w:t>
+      </w:r>
+      <w:proofErr w:type="spellStart"/>
+      <w:r>
+        <w:rPr>
+          <w:b/>
+          <w:bCs/>
+        </w:rPr>
+        <w:t>Keywords</w:t>
+      </w:r>
+      <w:proofErr w:type="spellEnd"/>
+      <w:r>
+        <w:rPr>
+          <w:b/>
+          <w:bCs/>
+        </w:rPr>
+        <w:t>):</w:t>
       </w:r>
       <w:r>
         <w:t xml:space="preserve"> Ingreso de términos técnicos que sirven para mejorar la precisión de la búsqueda semántica. Estas palabras guían al sistema para localizar los mejores fragmentos de información dentro de los documentos.</w:t>

</xml_diff>